<commit_message>
Admin screen and B2C student flow revamp
</commit_message>
<xml_diff>
--- a/testquest-app/docs/handover/Testquest-SRS.docx
+++ b/testquest-app/docs/handover/Testquest-SRS.docx
@@ -1268,26 +1268,26 @@
               <w:spacing w:after="0"/>
             </w:pPr>
             <w:r>
-              <w:t xml:space="preserve">Students shall register with name, email, password (min 6 chars), class (6–12), and board (CBSE/ICSE/State).</w:t>
-            </w:r>
-          </w:p>
-        </w:tc>
-        <w:tc>
-          <w:tcPr>
-            <w:tcW w:type="dxa" w:w="2340"/>
-            <w:tcMar>
-              <w:top w:type="dxa" w:w="80"/>
-              <w:left w:type="dxa" w:w="120"/>
-              <w:bottom w:type="dxa" w:w="80"/>
-              <w:right w:type="dxa" w:w="120"/>
-            </w:tcMar>
-          </w:tcPr>
-          <w:p>
-            <w:pPr>
-              <w:spacing w:after="0"/>
-            </w:pPr>
-            <w:r>
-              <w:t xml:space="preserve">Duplicate email rejected; invalid class rejected; account usable immediately; same account works on the mobile app.</w:t>
+              <w:t xml:space="preserve">Students shall register with name, email, and password (min 6 chars); mobile optional. Class and board are not collected at signup (class can be set later on the profile page; the API still accepts them for older clients).</w:t>
+            </w:r>
+          </w:p>
+        </w:tc>
+        <w:tc>
+          <w:tcPr>
+            <w:tcW w:type="dxa" w:w="2340"/>
+            <w:tcMar>
+              <w:top w:type="dxa" w:w="80"/>
+              <w:left w:type="dxa" w:w="120"/>
+              <w:bottom w:type="dxa" w:w="80"/>
+              <w:right w:type="dxa" w:w="120"/>
+            </w:tcMar>
+          </w:tcPr>
+          <w:p>
+            <w:pPr>
+              <w:spacing w:after="0"/>
+            </w:pPr>
+            <w:r>
+              <w:t xml:space="preserve">Duplicate email rejected; account usable immediately; same account works on the mobile app.</w:t>
             </w:r>
           </w:p>
         </w:tc>
@@ -1736,26 +1736,26 @@
               <w:spacing w:after="0"/>
             </w:pPr>
             <w:r>
-              <w:t xml:space="preserve">Protected pages shall redirect signed-out visitors to the appropriate login screen.</w:t>
-            </w:r>
-          </w:p>
-        </w:tc>
-        <w:tc>
-          <w:tcPr>
-            <w:tcW w:type="dxa" w:w="2340"/>
-            <w:tcMar>
-              <w:top w:type="dxa" w:w="80"/>
-              <w:left w:type="dxa" w:w="120"/>
-              <w:bottom w:type="dxa" w:w="80"/>
-              <w:right w:type="dxa" w:w="120"/>
-            </w:tcMar>
-          </w:tcPr>
-          <w:p>
-            <w:pPr>
-              <w:spacing w:after="0"/>
-            </w:pPr>
-            <w:r>
-              <w:t xml:space="preserve">Direct URL access to dashboards/admin/coaching without a session redirects to login.</w:t>
+              <w:t xml:space="preserve">Protected pages shall redirect signed-out visitors to the appropriate login screen, preserving the intended destination.</w:t>
+            </w:r>
+          </w:p>
+        </w:tc>
+        <w:tc>
+          <w:tcPr>
+            <w:tcW w:type="dxa" w:w="2340"/>
+            <w:tcMar>
+              <w:top w:type="dxa" w:w="80"/>
+              <w:left w:type="dxa" w:w="120"/>
+              <w:bottom w:type="dxa" w:w="80"/>
+              <w:right w:type="dxa" w:w="120"/>
+            </w:tcMar>
+          </w:tcPr>
+          <w:p>
+            <w:pPr>
+              <w:spacing w:after="0"/>
+            </w:pPr>
+            <w:r>
+              <w:t xml:space="preserve">Direct URL access to dashboard/attempts/profile/checkout/admin/coaching without a session redirects to login with a return path; after signing in the user lands on the page they originally requested.</w:t>
             </w:r>
           </w:p>
         </w:tc>
@@ -2123,26 +2123,26 @@
               <w:spacing w:after="0"/>
             </w:pPr>
             <w:r>
-              <w:t xml:space="preserve">Test detail shall show description and either Start (free/owned) or Buy (paid, not owned).</w:t>
-            </w:r>
-          </w:p>
-        </w:tc>
-        <w:tc>
-          <w:tcPr>
-            <w:tcW w:type="dxa" w:w="2340"/>
-            <w:tcMar>
-              <w:top w:type="dxa" w:w="80"/>
-              <w:left w:type="dxa" w:w="120"/>
-              <w:bottom w:type="dxa" w:w="80"/>
-              <w:right w:type="dxa" w:w="120"/>
-            </w:tcMar>
-          </w:tcPr>
-          <w:p>
-            <w:pPr>
-              <w:spacing w:after="0"/>
-            </w:pPr>
-            <w:r>
-              <w:t xml:space="preserve">Access reflects purchases and coaching assignments.</w:t>
+              <w:t xml:space="preserve">Test detail shall show description and either Start (free/owned) or Buy (paid, not owned). Guests may browse; acting on Start/Buy while signed out shall open a sign-in/create-account prompt and, after authentication, continue automatically (free test starts; paid test opens checkout).</w:t>
+            </w:r>
+          </w:p>
+        </w:tc>
+        <w:tc>
+          <w:tcPr>
+            <w:tcW w:type="dxa" w:w="2340"/>
+            <w:tcMar>
+              <w:top w:type="dxa" w:w="80"/>
+              <w:left w:type="dxa" w:w="120"/>
+              <w:bottom w:type="dxa" w:w="80"/>
+              <w:right w:type="dxa" w:w="120"/>
+            </w:tcMar>
+          </w:tcPr>
+          <w:p>
+            <w:pPr>
+              <w:spacing w:after="0"/>
+            </w:pPr>
+            <w:r>
+              <w:t xml:space="preserve">Access reflects purchases and coaching assignments; no raw error text is shown to guests.</w:t>
             </w:r>
           </w:p>
         </w:tc>

</xml_diff>